<commit_message>
Update first eight outline answers while preserving Word formatting
</commit_message>
<xml_diff>
--- a/Giai_de_cuong.docx
+++ b/Giai_de_cuong.docx
@@ -28,7 +28,7 @@
         <w:t>Bài 1. Trình bày khái niệm hiểm họa an toàn thông tin. Lấy ví dụ đối với hệ thống Wi-Fi của Học viện Kỹ thuật Mật mã.</w:t>
       </w:r>
     </w:p>
-    <w:p>
+    <w:p xmlns:w="http://schemas.openxmlformats.org/wordprocessingml/2006/main">
       <w:pPr>
         <w:keepLines w:val="0"/>
         <w:widowControl/>
@@ -46,7 +46,31 @@
           <w:sz w:val="21"/>
           <w:szCs w:val="21"/>
         </w:rPr>
-        <w:t>Hiểm họa an toàn thông tin là những sự kiện, tình huống hoặc tác nhân có khả năng gây tổn hại đến hệ thống thông tin, làm mất tính bí mật, tính toàn vẹn hoặc tính sẵn sàng của thông tin. Hiểm họa có thể xuất phát từ con người, thiên nhiên hoặc sự cố kỹ thuật, có chủ ý hoặc vô ý. Ví dụ đối với mạng Wi-Fi của Học viện: kẻ tấn công tạo điểm truy cập Wi-Fi giả mạo để đánh cắp tài khoản; nghe lén dữ liệu trên kết nối không được bảo vệ; tấn công từ chối dịch vụ làm gián đoạn kết nối; phát tán mã độc qua mạng; hoặc thiết bị phát Wi-Fi gặp sự cố khiến người dùng không thể truy cập Internet.</w:t>
+        <w:t xml:space="preserve">Hiểm họa an toàn thông tin là những khả năng tác động lên thông tin hoặc hệ thống thông tin, dẫn đến thay đổi, hư hại, sao chép trái phép, ngăn cản tiếp cận thông tin hoặc làm ngừng trệ hoạt động của hệ thống. Hiểm họa có thể xuất phát từ tự nhiên hoặc con người, do vô ý hoặc có chủ ý. Ví dụ, đối với mạng Wi-Fi của Học viện Kỹ thuật Mật mã, có thể xảy ra các hiểm họa như: kẻ tấn công tạo điểm truy cập Wi-Fi giả mạo để đánh cắp tài khoản; nghe lén dữ liệu truyền không được bảo vệ; truy cập trái phép bằng mật khẩu bị lộ; tấn công từ chối dịch vụ gây gián đoạn kết nối; mất điện hoặc hỏng thiết bị phát Wi-Fi làm hệ thống ngừng hoạt động. Đây là các tình huống giả định, không phải sự cố đã được xác nhận tại Học viện.</w:t>
+      </w:r>
+    </w:p>
+    <w:p xmlns:w="http://schemas.openxmlformats.org/wordprocessingml/2006/main">
+      <w:pPr>
+        <w:keepLines w:val="0"/>
+        <w:widowControl/>
+        <w:autoSpaceDE/>
+        <w:autoSpaceDN/>
+        <w:spacing w:after="60" w:before="0" w:line="269" w:lineRule="auto"/>
+        <w:rPr>
+          <w:color w:val="666666"/>
+          <w:sz w:val="18"/>
+          <w:szCs w:val="18"/>
+        </w:rPr>
+      </w:pPr>
+      <w:r>
+        <w:rPr>
+          <w:rFonts w:ascii="Calibri" w:hAnsi="Calibri" w:eastAsia="Calibri" w:cs="Calibri"/>
+          <w:color w:val="5B656F"/>
+          <w:sz w:val="18"/>
+          <w:szCs w:val="18"/>
+          <w:i/>
+        </w:rPr>
+        <w:t xml:space="preserve">Nguồn: Slide PDF trang 51, 57, 59–66. Ví dụ Wi-Fi là phần vận dụng.</w:t>
       </w:r>
     </w:p>
     <w:p>
@@ -75,7 +99,7 @@
         <w:t>Bài 2. Trình bày khái niệm định danh và xác thực và vai trò đối với an toàn hệ thống thông tin.</w:t>
       </w:r>
     </w:p>
-    <w:p>
+    <w:p xmlns:w="http://schemas.openxmlformats.org/wordprocessingml/2006/main">
       <w:pPr>
         <w:keepLines w:val="0"/>
         <w:widowControl/>
@@ -93,7 +117,31 @@
           <w:sz w:val="21"/>
           <w:szCs w:val="21"/>
         </w:rPr>
-        <w:t>Định danh (Identification) là quá trình một chủ thể khai báo danh tính của mình với hệ thống thông qua thông tin nhận dạng như tên đăng nhập hoặc mã người dùng. Xác thực (Authentication) là quá trình kiểm tra bằng chứng nhằm xác minh chủ thể có thực sự sở hữu danh tính đã khai báo hay không. Định danh và xác thực giúp hệ thống nhận biết đúng người dùng, ngăn chặn truy cập trái phép, tạo cơ sở cho việc phân quyền, ghi nhật ký và truy vết hoạt động, qua đó góp phần bảo đảm an toàn thông tin.</w:t>
+        <w:t xml:space="preserve">Định danh (Identification) là quá trình gắn định danh cho người dùng và kiểm tra sự tồn tại của định danh đó trong hệ thống, nhưng chưa kiểm tra tính chân thực của danh tính. Xác thực (Authentication) là quá trình kiểm tra tính chân thực của danh tính đã được xác lập trong bước định danh, thông qua các nhân tố và giao thức xác thực. Ví dụ, người dùng nhập tên đăng nhập để định danh và cung cấp mật khẩu để xác thực. Định danh và xác thực giúp hệ thống nhận biết đúng chủ thể, hạn chế giả mạo, ngăn ngừa truy cập trái phép và tạo cơ sở cho kiểm soát truy cập, ghi nhật ký và truy vết. Tuy nhiên, xác thực không bao gồm việc xác định quyền hạn của người dùng.</w:t>
+      </w:r>
+    </w:p>
+    <w:p xmlns:w="http://schemas.openxmlformats.org/wordprocessingml/2006/main">
+      <w:pPr>
+        <w:keepLines w:val="0"/>
+        <w:widowControl/>
+        <w:autoSpaceDE/>
+        <w:autoSpaceDN/>
+        <w:spacing w:after="60" w:before="0" w:line="269" w:lineRule="auto"/>
+        <w:rPr>
+          <w:color w:val="666666"/>
+          <w:sz w:val="18"/>
+          <w:szCs w:val="18"/>
+        </w:rPr>
+      </w:pPr>
+      <w:r>
+        <w:rPr>
+          <w:rFonts w:ascii="Calibri" w:hAnsi="Calibri" w:eastAsia="Calibri" w:cs="Calibri"/>
+          <w:color w:val="5B656F"/>
+          <w:sz w:val="18"/>
+          <w:szCs w:val="18"/>
+          <w:i/>
+        </w:rPr>
+        <w:t xml:space="preserve">Nguồn: Slide PDF trang 108–110.</w:t>
       </w:r>
     </w:p>
     <w:p>
@@ -122,7 +170,7 @@
         <w:t>Bài 3. Trình bày các nhân tố xác thực phổ biến và ưu, nhược điểm.</w:t>
       </w:r>
     </w:p>
-    <w:p>
+    <w:p xmlns:w="http://schemas.openxmlformats.org/wordprocessingml/2006/main">
       <w:pPr>
         <w:keepLines w:val="0"/>
         <w:widowControl/>
@@ -140,7 +188,126 @@
           <w:sz w:val="21"/>
           <w:szCs w:val="21"/>
         </w:rPr>
-        <w:t>Có ba nhóm nhân tố xác thực phổ biến: nhân tố tri thức (Something you know), như mật khẩu hoặc mã PIN, có ưu điểm đơn giản, chi phí thấp nhưng dễ bị đoán, đánh cắp hoặc lộ lọt; nhân tố sở hữu (Something you have), như thẻ thông minh, khóa bảo mật hoặc thiết bị tạo OTP, có ưu điểm tăng độ an toàn nhờ yêu cầu sở hữu thiết bị nhưng có thể bị mất, đánh cắp hoặc sao chép tùy công nghệ; nhân tố đặc điểm sinh học (Something you are), như vân tay, khuôn mặt hoặc mống mắt, thuận tiện và khó chuyển giao nhưng có thể xảy ra nhận dạng sai, giả mạo sinh trắc học và khó thay đổi nếu dữ liệu sinh trắc học bị lộ.</w:t>
+        <w:t xml:space="preserve">Nhân tố xác thực là thông tin được sử dụng trong quá trình xác thực. Có ba nhóm chính: </w:t>
+      </w:r>
+      <w:r>
+        <w:rPr>
+          <w:rFonts w:ascii="Calibri" w:hAnsi="Calibri" w:eastAsia="Calibri" w:cs="Calibri"/>
+          <w:color w:val="232A32"/>
+          <w:sz w:val="21"/>
+          <w:szCs w:val="21"/>
+          <w:b/>
+        </w:rPr>
+        <w:t xml:space="preserve">cái người dùng biết</w:t>
+      </w:r>
+      <w:r>
+        <w:rPr>
+          <w:rFonts w:ascii="Calibri" w:hAnsi="Calibri" w:eastAsia="Calibri" w:cs="Calibri"/>
+          <w:color w:val="232A32"/>
+          <w:sz w:val="21"/>
+          <w:szCs w:val="21"/>
+        </w:rPr>
+        <w:t xml:space="preserve">, như mật khẩu, mã PIN, có ưu điểm đơn giản, chi phí thấp nhưng dễ bị lộ hoặc quên; </w:t>
+      </w:r>
+      <w:r>
+        <w:rPr>
+          <w:rFonts w:ascii="Calibri" w:hAnsi="Calibri" w:eastAsia="Calibri" w:cs="Calibri"/>
+          <w:color w:val="232A32"/>
+          <w:sz w:val="21"/>
+          <w:szCs w:val="21"/>
+          <w:b/>
+        </w:rPr>
+        <w:t xml:space="preserve">cái người dùng có</w:t>
+      </w:r>
+      <w:r>
+        <w:rPr>
+          <w:rFonts w:ascii="Calibri" w:hAnsi="Calibri" w:eastAsia="Calibri" w:cs="Calibri"/>
+          <w:color w:val="232A32"/>
+          <w:sz w:val="21"/>
+          <w:szCs w:val="21"/>
+        </w:rPr>
+        <w:t xml:space="preserve">, như thẻ thông minh, OTP token, khóa mật mã, phù hợp với xác thực đa nhân tố nhưng có chi phí cao và có thể bị mất, chiếm đoạt hoặc làm giả; </w:t>
+      </w:r>
+      <w:r>
+        <w:rPr>
+          <w:rFonts w:ascii="Calibri" w:hAnsi="Calibri" w:eastAsia="Calibri" w:cs="Calibri"/>
+          <w:color w:val="232A32"/>
+          <w:sz w:val="21"/>
+          <w:szCs w:val="21"/>
+          <w:b/>
+        </w:rPr>
+        <w:t xml:space="preserve">cái thuộc về bản thể người dùng</w:t>
+      </w:r>
+      <w:r>
+        <w:rPr>
+          <w:rFonts w:ascii="Calibri" w:hAnsi="Calibri" w:eastAsia="Calibri" w:cs="Calibri"/>
+          <w:color w:val="232A32"/>
+          <w:sz w:val="21"/>
+          <w:szCs w:val="21"/>
+        </w:rPr>
+        <w:t xml:space="preserve">, như vân tay, khuôn mặt, võng mạc, giọng nói, thuận tiện, khó chuyển giao nhưng có chi phí triển khai cao, đặc điểm có thể thay đổi theo thể trạng và tồn tại nguy cơ nhận dạng sai hoặc giả mạo. Ngoài ra, slide nêu hai nhóm bổ sung là </w:t>
+      </w:r>
+      <w:r>
+        <w:rPr>
+          <w:rFonts w:ascii="Calibri" w:hAnsi="Calibri" w:eastAsia="Calibri" w:cs="Calibri"/>
+          <w:color w:val="232A32"/>
+          <w:sz w:val="21"/>
+          <w:szCs w:val="21"/>
+          <w:b/>
+        </w:rPr>
+        <w:t xml:space="preserve">đặc điểm hành vi</w:t>
+      </w:r>
+      <w:r>
+        <w:rPr>
+          <w:rFonts w:ascii="Calibri" w:hAnsi="Calibri" w:eastAsia="Calibri" w:cs="Calibri"/>
+          <w:color w:val="232A32"/>
+          <w:sz w:val="21"/>
+          <w:szCs w:val="21"/>
+        </w:rPr>
+        <w:t xml:space="preserve"> (nhịp gõ bàn phím, đặc trưng chữ ký viết tay), có thể thay đổi theo thời gian; và </w:t>
+      </w:r>
+      <w:r>
+        <w:rPr>
+          <w:rFonts w:ascii="Calibri" w:hAnsi="Calibri" w:eastAsia="Calibri" w:cs="Calibri"/>
+          <w:color w:val="232A32"/>
+          <w:sz w:val="21"/>
+          <w:szCs w:val="21"/>
+          <w:b/>
+        </w:rPr>
+        <w:t xml:space="preserve">vị trí người dùng</w:t>
+      </w:r>
+      <w:r>
+        <w:rPr>
+          <w:rFonts w:ascii="Calibri" w:hAnsi="Calibri" w:eastAsia="Calibri" w:cs="Calibri"/>
+          <w:color w:val="232A32"/>
+          <w:sz w:val="21"/>
+          <w:szCs w:val="21"/>
+        </w:rPr>
+        <w:t xml:space="preserve"> (định vị GPS), có hạn chế về chi phí và nguy cơ làm lộ thông tin riêng tư.</w:t>
+      </w:r>
+    </w:p>
+    <w:p xmlns:w="http://schemas.openxmlformats.org/wordprocessingml/2006/main">
+      <w:pPr>
+        <w:keepLines w:val="0"/>
+        <w:widowControl/>
+        <w:autoSpaceDE/>
+        <w:autoSpaceDN/>
+        <w:spacing w:after="60" w:before="0" w:line="269" w:lineRule="auto"/>
+        <w:rPr>
+          <w:color w:val="666666"/>
+          <w:sz w:val="18"/>
+          <w:szCs w:val="18"/>
+        </w:rPr>
+      </w:pPr>
+      <w:r>
+        <w:rPr>
+          <w:rFonts w:ascii="Calibri" w:hAnsi="Calibri" w:eastAsia="Calibri" w:cs="Calibri"/>
+          <w:color w:val="5B656F"/>
+          <w:sz w:val="18"/>
+          <w:szCs w:val="18"/>
+          <w:i/>
+        </w:rPr>
+        <w:t xml:space="preserve">Nguồn: Slide PDF trang 112–117. Nhận xét về giả mạo sinh trắc là phần làm rõ kỹ thuật, tránh hiểu tuyệt đối rằng sinh trắc học không thể bị sao chép.</w:t>
       </w:r>
     </w:p>
     <w:p>
@@ -169,7 +336,7 @@
         <w:t>Bài 4. Xác thực đa nhân tố là gì? Nêu ví dụ.</w:t>
       </w:r>
     </w:p>
-    <w:p>
+    <w:p xmlns:w="http://schemas.openxmlformats.org/wordprocessingml/2006/main">
       <w:pPr>
         <w:keepLines w:val="0"/>
         <w:widowControl/>
@@ -187,7 +354,31 @@
           <w:sz w:val="21"/>
           <w:szCs w:val="21"/>
         </w:rPr>
-        <w:t>Xác thực đa nhân tố (Multi-Factor Authentication – MFA) là phương pháp xác thực sử dụng ít nhất hai nhân tố thuộc các nhóm khác nhau để kiểm tra danh tính người dùng, nhằm tăng độ an toàn khi một nhân tố bị lộ hoặc đánh cắp. Ví dụ: khi đăng nhập tài khoản ngân hàng, người dùng phải nhập mật khẩu (nhân tố tri thức) và xác nhận bằng ứng dụng trên điện thoại đã đăng ký (nhân tố sở hữu). Việc sử dụng hai mật khẩu không được coi là xác thực đa nhân tố.</w:t>
+        <w:t xml:space="preserve">Xác thực đa nhân tố (Multi-Factor Authentication – MFA) là phương pháp xác thực kết hợp ít nhất hai nhân tố thuộc các nhóm khác nhau để kiểm tra danh tính người dùng, qua đó tăng độ an toàn khi một nhân tố bị lộ hoặc đánh cắp. Ví dụ, sử dụng thẻ thông minh (cái người dùng có) kết hợp mã PIN (cái người dùng biết); hoặc mật khẩu kết hợp mã OTP được tạo trên thiết bị đã đăng ký. Việc sử dụng hai mật khẩu không được coi là xác thực đa nhân tố vì cả hai đều thuộc nhóm nhân tố tri thức.</w:t>
+      </w:r>
+    </w:p>
+    <w:p xmlns:w="http://schemas.openxmlformats.org/wordprocessingml/2006/main">
+      <w:pPr>
+        <w:keepLines w:val="0"/>
+        <w:widowControl/>
+        <w:autoSpaceDE/>
+        <w:autoSpaceDN/>
+        <w:spacing w:after="60" w:before="0" w:line="269" w:lineRule="auto"/>
+        <w:rPr>
+          <w:color w:val="666666"/>
+          <w:sz w:val="18"/>
+          <w:szCs w:val="18"/>
+        </w:rPr>
+      </w:pPr>
+      <w:r>
+        <w:rPr>
+          <w:rFonts w:ascii="Calibri" w:hAnsi="Calibri" w:eastAsia="Calibri" w:cs="Calibri"/>
+          <w:color w:val="5B656F"/>
+          <w:sz w:val="18"/>
+          <w:szCs w:val="18"/>
+          <w:i/>
+        </w:rPr>
+        <w:t xml:space="preserve">Nguồn: Slide PDF trang 112, 118.</w:t>
       </w:r>
     </w:p>
     <w:p>
@@ -216,7 +407,7 @@
         <w:t>Bài 5. Trình bày khái niệm mật khẩu và nguyên nhân gây thiếu an toàn đối với mật khẩu.</w:t>
       </w:r>
     </w:p>
-    <w:p>
+    <w:p xmlns:w="http://schemas.openxmlformats.org/wordprocessingml/2006/main">
       <w:pPr>
         <w:keepLines w:val="0"/>
         <w:widowControl/>
@@ -234,7 +425,31 @@
           <w:sz w:val="21"/>
           <w:szCs w:val="21"/>
         </w:rPr>
-        <w:t>Mật khẩu (Password) là một chuỗi ký tự bí mật được dùng để chứng minh danh tính của người dùng trong quá trình xác thực. Mật khẩu trở nên thiếu an toàn khi quá ngắn, dễ đoán, chứa thông tin cá nhân, sử dụng giá trị mặc định hoặc được dùng lại trên nhiều hệ thống. Ngoài ra, việc chia sẻ mật khẩu, lưu trữ hoặc truyền mật khẩu không an toàn, sử dụng thiết bị nhiễm mã độc và thiếu cơ chế giới hạn số lần đăng nhập sai cũng làm tăng nguy cơ mật khẩu bị lộ hoặc bị khai thác.</w:t>
+        <w:t xml:space="preserve">Mật khẩu là một lượng thông tin bí mật mà người dùng và hệ thống xác thực biết, được người dùng cung cấp để thực hiện thủ tục xác thực. Mật khẩu gồm mật khẩu một lần và mật khẩu dài hạn. Độ an toàn của mật khẩu phụ thuộc vào độ dài, tập ký tự, cách lựa chọn và sử dụng. Các nguyên nhân gây thiếu an toàn gồm: người dùng chọn mật khẩu đơn giản, dễ nhớ nên dễ đoán; sử dụng mật khẩu mặc định mà không thay đổi; ghi hoặc lưu mật khẩu tại nơi dễ tiếp cận; sử dụng chung một mật khẩu cho nhiều hệ thống; đặt mật khẩu liên quan đến thông tin cá nhân; chia sẻ mật khẩu hoặc để người khác nhìn thấy khi nhập. Những hành vi này tạo điều kiện cho kẻ tấn công dò đoán, đánh cắp và chiếm quyền truy cập.</w:t>
+      </w:r>
+    </w:p>
+    <w:p xmlns:w="http://schemas.openxmlformats.org/wordprocessingml/2006/main">
+      <w:pPr>
+        <w:keepLines w:val="0"/>
+        <w:widowControl/>
+        <w:autoSpaceDE/>
+        <w:autoSpaceDN/>
+        <w:spacing w:after="60" w:before="0" w:line="269" w:lineRule="auto"/>
+        <w:rPr>
+          <w:color w:val="666666"/>
+          <w:sz w:val="18"/>
+          <w:szCs w:val="18"/>
+        </w:rPr>
+      </w:pPr>
+      <w:r>
+        <w:rPr>
+          <w:rFonts w:ascii="Calibri" w:hAnsi="Calibri" w:eastAsia="Calibri" w:cs="Calibri"/>
+          <w:color w:val="5B656F"/>
+          <w:sz w:val="18"/>
+          <w:szCs w:val="18"/>
+          <w:i/>
+        </w:rPr>
+        <w:t xml:space="preserve">Nguồn: Slide PDF trang 121–123, 125–126, 135.</w:t>
       </w:r>
     </w:p>
     <w:p>
@@ -263,7 +478,7 @@
         <w:t>Bài 6. Trình bày các hiểm họa an toàn đối với mật khẩu.</w:t>
       </w:r>
     </w:p>
-    <w:p>
+    <w:p xmlns:w="http://schemas.openxmlformats.org/wordprocessingml/2006/main">
       <w:pPr>
         <w:keepLines w:val="0"/>
         <w:widowControl/>
@@ -281,7 +496,126 @@
           <w:sz w:val="21"/>
           <w:szCs w:val="21"/>
         </w:rPr>
-        <w:t>Các hiểm họa đối với mật khẩu gồm: tấn công vét cạn (Brute Force) bằng cách thử nhiều khả năng; tấn công từ điển (Dictionary Attack) sử dụng các mật khẩu phổ biến; Password Spraying thử một số mật khẩu thông dụng trên nhiều tài khoản; Credential Stuffing sử dụng thông tin đăng nhập đã bị lộ từ hệ thống khác; lừa đảo Phishing để lấy mật khẩu; sử dụng Keylogger ghi lại thao tác bàn phím; nghe lén khi mật khẩu truyền qua kênh không an toàn; và tấn công ngoại tuyến nhằm khôi phục mật khẩu từ dữ liệu băm bị đánh cắp. Các hiểm họa này có thể dẫn đến chiếm đoạt tài khoản và truy cập trái phép.</w:t>
+        <w:t xml:space="preserve">Các hiểm họa đối với mật khẩu gồm: </w:t>
+      </w:r>
+      <w:r>
+        <w:rPr>
+          <w:rFonts w:ascii="Calibri" w:hAnsi="Calibri" w:eastAsia="Calibri" w:cs="Calibri"/>
+          <w:color w:val="232A32"/>
+          <w:sz w:val="21"/>
+          <w:szCs w:val="21"/>
+          <w:b/>
+        </w:rPr>
+        <w:t xml:space="preserve">dò đoán mật khẩu</w:t>
+      </w:r>
+      <w:r>
+        <w:rPr>
+          <w:rFonts w:ascii="Calibri" w:hAnsi="Calibri" w:eastAsia="Calibri" w:cs="Calibri"/>
+          <w:color w:val="232A32"/>
+          <w:sz w:val="21"/>
+          <w:szCs w:val="21"/>
+        </w:rPr>
+        <w:t xml:space="preserve"> bằng thông tin cá nhân, từ điển hoặc vét cạn; </w:t>
+      </w:r>
+      <w:r>
+        <w:rPr>
+          <w:rFonts w:ascii="Calibri" w:hAnsi="Calibri" w:eastAsia="Calibri" w:cs="Calibri"/>
+          <w:color w:val="232A32"/>
+          <w:sz w:val="21"/>
+          <w:szCs w:val="21"/>
+          <w:b/>
+        </w:rPr>
+        <w:t xml:space="preserve">đánh cắp mật khẩu</w:t>
+      </w:r>
+      <w:r>
+        <w:rPr>
+          <w:rFonts w:ascii="Calibri" w:hAnsi="Calibri" w:eastAsia="Calibri" w:cs="Calibri"/>
+          <w:color w:val="232A32"/>
+          <w:sz w:val="21"/>
+          <w:szCs w:val="21"/>
+        </w:rPr>
+        <w:t xml:space="preserve"> bằng nhìn trộm, keylogger, chương trình độc hại, lừa đảo hoặc khai thác lỗ hổng ứng dụng; </w:t>
+      </w:r>
+      <w:r>
+        <w:rPr>
+          <w:rFonts w:ascii="Calibri" w:hAnsi="Calibri" w:eastAsia="Calibri" w:cs="Calibri"/>
+          <w:color w:val="232A32"/>
+          <w:sz w:val="21"/>
+          <w:szCs w:val="21"/>
+          <w:b/>
+        </w:rPr>
+        <w:t xml:space="preserve">lộ mật khẩu</w:t>
+      </w:r>
+      <w:r>
+        <w:rPr>
+          <w:rFonts w:ascii="Calibri" w:hAnsi="Calibri" w:eastAsia="Calibri" w:cs="Calibri"/>
+          <w:color w:val="232A32"/>
+          <w:sz w:val="21"/>
+          <w:szCs w:val="21"/>
+        </w:rPr>
+        <w:t xml:space="preserve"> do người dùng chia sẻ, ghi chép tại nơi dễ tiếp cận hoặc sử dụng mật khẩu yếu; </w:t>
+      </w:r>
+      <w:r>
+        <w:rPr>
+          <w:rFonts w:ascii="Calibri" w:hAnsi="Calibri" w:eastAsia="Calibri" w:cs="Calibri"/>
+          <w:color w:val="232A32"/>
+          <w:sz w:val="21"/>
+          <w:szCs w:val="21"/>
+          <w:b/>
+        </w:rPr>
+        <w:t xml:space="preserve">đánh cắp cơ sở dữ liệu mật khẩu</w:t>
+      </w:r>
+      <w:r>
+        <w:rPr>
+          <w:rFonts w:ascii="Calibri" w:hAnsi="Calibri" w:eastAsia="Calibri" w:cs="Calibri"/>
+          <w:color w:val="232A32"/>
+          <w:sz w:val="21"/>
+          <w:szCs w:val="21"/>
+        </w:rPr>
+        <w:t xml:space="preserve"> để thực hiện tấn công ngoại tuyến; </w:t>
+      </w:r>
+      <w:r>
+        <w:rPr>
+          <w:rFonts w:ascii="Calibri" w:hAnsi="Calibri" w:eastAsia="Calibri" w:cs="Calibri"/>
+          <w:color w:val="232A32"/>
+          <w:sz w:val="21"/>
+          <w:szCs w:val="21"/>
+          <w:b/>
+        </w:rPr>
+        <w:t xml:space="preserve">khai thác lỗi thiết kế hoặc làm hỏng hệ thống mật khẩu</w:t>
+      </w:r>
+      <w:r>
+        <w:rPr>
+          <w:rFonts w:ascii="Calibri" w:hAnsi="Calibri" w:eastAsia="Calibri" w:cs="Calibri"/>
+          <w:color w:val="232A32"/>
+          <w:sz w:val="21"/>
+          <w:szCs w:val="21"/>
+        </w:rPr>
+        <w:t xml:space="preserve">. Đặc biệt, khi xác thực qua mạng có bốn hiểm họa: chặn bắt và sử dụng lại thông tin (Replay Attack); chặn bắt để khôi phục mật khẩu; thay đổi thông tin nhằm đánh lừa bên xác thực; và giả mạo bên xác thực để lừa người dùng tiết lộ mật khẩu. Các hiểm họa có thể dẫn đến lộ thông tin và chiếm đoạt tài khoản.</w:t>
+      </w:r>
+    </w:p>
+    <w:p xmlns:w="http://schemas.openxmlformats.org/wordprocessingml/2006/main">
+      <w:pPr>
+        <w:keepLines w:val="0"/>
+        <w:widowControl/>
+        <w:autoSpaceDE/>
+        <w:autoSpaceDN/>
+        <w:spacing w:after="60" w:before="0" w:line="269" w:lineRule="auto"/>
+        <w:rPr>
+          <w:color w:val="666666"/>
+          <w:sz w:val="18"/>
+          <w:szCs w:val="18"/>
+        </w:rPr>
+      </w:pPr>
+      <w:r>
+        <w:rPr>
+          <w:rFonts w:ascii="Calibri" w:hAnsi="Calibri" w:eastAsia="Calibri" w:cs="Calibri"/>
+          <w:color w:val="5B656F"/>
+          <w:sz w:val="18"/>
+          <w:szCs w:val="18"/>
+          <w:i/>
+        </w:rPr>
+        <w:t xml:space="preserve">Nguồn: Slide PDF trang 125–129.</w:t>
       </w:r>
     </w:p>
     <w:p>
@@ -310,7 +644,7 @@
         <w:t>Bài 7. Xây dựng chính sách mật khẩu an toàn và giải thích ý nghĩa.</w:t>
       </w:r>
     </w:p>
-    <w:p>
+    <w:p xmlns:w="http://schemas.openxmlformats.org/wordprocessingml/2006/main">
       <w:pPr>
         <w:keepLines w:val="0"/>
         <w:widowControl/>
@@ -328,17 +662,240 @@
           <w:sz w:val="21"/>
           <w:szCs w:val="21"/>
         </w:rPr>
-        <w:t xml:space="preserve">Chính sách mật khẩu an toàn cần quy định người dùng sử dụng mật khẩu đủ dài, khó đoán và riêng biệt cho từng tài khoản; ưu tiên tối thiểu 15 ký tự khi mật khẩu là nhân tố xác thực duy nhất, đồng thời kiểm tra và từ chối mật khẩu phổ biến hoặc đã bị lộ nhằm hạn chế tấn công dò đoán. Hệ thống phải lưu mật khẩu dưới dạng giá trị băm </w:t>
-      </w:r>
-      <w:r>
-        <w:rPr>
-          <w:rFonts w:ascii="Calibri" w:hAnsi="Calibri" w:eastAsia="Calibri" w:cs="Calibri"/>
-          <w:color w:val="232A32"/>
-          <w:sz w:val="21"/>
-          <w:szCs w:val="21"/>
-        </w:rPr>
-        <w:lastRenderedPageBreak/>
-        <w:t>có muối (salt) bằng thuật toán dẫn xuất mật khẩu phù hợp để giảm nguy cơ khôi phục mật khẩu khi cơ sở dữ liệu bị lộ; truyền mật khẩu qua kênh mã hóa để chống nghe lén; giới hạn tốc độ thử đăng nhập để chống vét cạn; áp dụng xác thực đa nhân tố để tăng khả năng bảo vệ tài khoản; và buộc thay mật khẩu khi có bằng chứng bị lộ. Người dùng phải giữ bí mật mật khẩu và được khuyến khích sử dụng trình quản lý mật khẩu. Mỗi quy định nhằm giảm khả năng mật khẩu bị đoán, đánh cắp hoặc lợi dụng để truy cập trái phép.</w:t>
+        <w:t xml:space="preserve">Theo các yêu cầu quản lý mật khẩu trong slide, chính sách mật khẩu cần quy định: </w:t>
+      </w:r>
+      <w:r>
+        <w:rPr>
+          <w:rFonts w:ascii="Calibri" w:hAnsi="Calibri" w:eastAsia="Calibri" w:cs="Calibri"/>
+          <w:color w:val="232A32"/>
+          <w:sz w:val="21"/>
+          <w:szCs w:val="21"/>
+          <w:b/>
+        </w:rPr>
+        <w:t xml:space="preserve">(1)</w:t>
+      </w:r>
+      <w:r>
+        <w:rPr>
+          <w:rFonts w:ascii="Calibri" w:hAnsi="Calibri" w:eastAsia="Calibri" w:cs="Calibri"/>
+          <w:color w:val="232A32"/>
+          <w:sz w:val="21"/>
+          <w:szCs w:val="21"/>
+        </w:rPr>
+        <w:t xml:space="preserve"> độ dài tối thiểu để tăng độ khó khi dò đoán, vét cạn; </w:t>
+      </w:r>
+      <w:r>
+        <w:rPr>
+          <w:rFonts w:ascii="Calibri" w:hAnsi="Calibri" w:eastAsia="Calibri" w:cs="Calibri"/>
+          <w:color w:val="232A32"/>
+          <w:sz w:val="21"/>
+          <w:szCs w:val="21"/>
+          <w:b/>
+        </w:rPr>
+        <w:t xml:space="preserve">(2)</w:t>
+      </w:r>
+      <w:r>
+        <w:rPr>
+          <w:rFonts w:ascii="Calibri" w:hAnsi="Calibri" w:eastAsia="Calibri" w:cs="Calibri"/>
+          <w:color w:val="232A32"/>
+          <w:sz w:val="21"/>
+          <w:szCs w:val="21"/>
+        </w:rPr>
+        <w:t xml:space="preserve"> sử dụng nhiều nhóm ký tự để mở rộng không gian tìm kiếm; </w:t>
+      </w:r>
+      <w:r>
+        <w:rPr>
+          <w:rFonts w:ascii="Calibri" w:hAnsi="Calibri" w:eastAsia="Calibri" w:cs="Calibri"/>
+          <w:color w:val="232A32"/>
+          <w:sz w:val="21"/>
+          <w:szCs w:val="21"/>
+          <w:b/>
+        </w:rPr>
+        <w:t xml:space="preserve">(3)</w:t>
+      </w:r>
+      <w:r>
+        <w:rPr>
+          <w:rFonts w:ascii="Calibri" w:hAnsi="Calibri" w:eastAsia="Calibri" w:cs="Calibri"/>
+          <w:color w:val="232A32"/>
+          <w:sz w:val="21"/>
+          <w:szCs w:val="21"/>
+        </w:rPr>
+        <w:t xml:space="preserve"> kiểm tra và loại bỏ mật khẩu có trong từ điển để chống đoán mật khẩu phổ biến; </w:t>
+      </w:r>
+      <w:r>
+        <w:rPr>
+          <w:rFonts w:ascii="Calibri" w:hAnsi="Calibri" w:eastAsia="Calibri" w:cs="Calibri"/>
+          <w:color w:val="232A32"/>
+          <w:sz w:val="21"/>
+          <w:szCs w:val="21"/>
+          <w:b/>
+        </w:rPr>
+        <w:t xml:space="preserve">(4)</w:t>
+      </w:r>
+      <w:r>
+        <w:rPr>
+          <w:rFonts w:ascii="Calibri" w:hAnsi="Calibri" w:eastAsia="Calibri" w:cs="Calibri"/>
+          <w:color w:val="232A32"/>
+          <w:sz w:val="21"/>
+          <w:szCs w:val="21"/>
+        </w:rPr>
+        <w:t xml:space="preserve"> quy định thời gian hiệu lực tối đa nhằm hạn chế thời gian sử dụng một mật khẩu; </w:t>
+      </w:r>
+      <w:r>
+        <w:rPr>
+          <w:rFonts w:ascii="Calibri" w:hAnsi="Calibri" w:eastAsia="Calibri" w:cs="Calibri"/>
+          <w:color w:val="232A32"/>
+          <w:sz w:val="21"/>
+          <w:szCs w:val="21"/>
+          <w:b/>
+        </w:rPr>
+        <w:t xml:space="preserve">(5)</w:t>
+      </w:r>
+      <w:r>
+        <w:rPr>
+          <w:rFonts w:ascii="Calibri" w:hAnsi="Calibri" w:eastAsia="Calibri" w:cs="Calibri"/>
+          <w:color w:val="232A32"/>
+          <w:sz w:val="21"/>
+          <w:szCs w:val="21"/>
+        </w:rPr>
+        <w:t xml:space="preserve"> quy định thời gian sử dụng tối thiểu để hạn chế việc đổi liên tiếp nhằm quay lại mật khẩu cũ; </w:t>
+      </w:r>
+      <w:r>
+        <w:rPr>
+          <w:rFonts w:ascii="Calibri" w:hAnsi="Calibri" w:eastAsia="Calibri" w:cs="Calibri"/>
+          <w:color w:val="232A32"/>
+          <w:sz w:val="21"/>
+          <w:szCs w:val="21"/>
+          <w:b/>
+        </w:rPr>
+        <w:t xml:space="preserve">(6)</w:t>
+      </w:r>
+      <w:r>
+        <w:rPr>
+          <w:rFonts w:ascii="Calibri" w:hAnsi="Calibri" w:eastAsia="Calibri" w:cs="Calibri"/>
+          <w:color w:val="232A32"/>
+          <w:sz w:val="21"/>
+          <w:szCs w:val="21"/>
+        </w:rPr>
+        <w:t xml:space="preserve"> giới hạn số lần nhập sai để chống dò mật khẩu trực tuyến; </w:t>
+      </w:r>
+      <w:r>
+        <w:rPr>
+          <w:rFonts w:ascii="Calibri" w:hAnsi="Calibri" w:eastAsia="Calibri" w:cs="Calibri"/>
+          <w:color w:val="232A32"/>
+          <w:sz w:val="21"/>
+          <w:szCs w:val="21"/>
+          <w:b/>
+        </w:rPr>
+        <w:t xml:space="preserve">(7)</w:t>
+      </w:r>
+      <w:r>
+        <w:rPr>
+          <w:rFonts w:ascii="Calibri" w:hAnsi="Calibri" w:eastAsia="Calibri" w:cs="Calibri"/>
+          <w:color w:val="232A32"/>
+          <w:sz w:val="21"/>
+          <w:szCs w:val="21"/>
+        </w:rPr>
+        <w:t xml:space="preserve"> bắt buộc thay đổi mật khẩu theo định kỳ trong chính sách của giáo trình; </w:t>
+      </w:r>
+      <w:r>
+        <w:rPr>
+          <w:rFonts w:ascii="Calibri" w:hAnsi="Calibri" w:eastAsia="Calibri" w:cs="Calibri"/>
+          <w:color w:val="232A32"/>
+          <w:sz w:val="21"/>
+          <w:szCs w:val="21"/>
+          <w:b/>
+        </w:rPr>
+        <w:t xml:space="preserve">(8)</w:t>
+      </w:r>
+      <w:r>
+        <w:rPr>
+          <w:rFonts w:ascii="Calibri" w:hAnsi="Calibri" w:eastAsia="Calibri" w:cs="Calibri"/>
+          <w:color w:val="232A32"/>
+          <w:sz w:val="21"/>
+          <w:szCs w:val="21"/>
+        </w:rPr>
+        <w:t xml:space="preserve"> tăng thời gian chờ sau các lần nhập sai để làm chậm tấn công; </w:t>
+      </w:r>
+      <w:r>
+        <w:rPr>
+          <w:rFonts w:ascii="Calibri" w:hAnsi="Calibri" w:eastAsia="Calibri" w:cs="Calibri"/>
+          <w:color w:val="232A32"/>
+          <w:sz w:val="21"/>
+          <w:szCs w:val="21"/>
+          <w:b/>
+        </w:rPr>
+        <w:t xml:space="preserve">(9)</w:t>
+      </w:r>
+      <w:r>
+        <w:rPr>
+          <w:rFonts w:ascii="Calibri" w:hAnsi="Calibri" w:eastAsia="Calibri" w:cs="Calibri"/>
+          <w:color w:val="232A32"/>
+          <w:sz w:val="21"/>
+          <w:szCs w:val="21"/>
+        </w:rPr>
+        <w:t xml:space="preserve"> sử dụng mật khẩu sinh tự động thay vì để người dùng tự chọn theo yêu cầu của giáo trình, nhằm giảm mật khẩu dễ đoán; </w:t>
+      </w:r>
+      <w:r>
+        <w:rPr>
+          <w:rFonts w:ascii="Calibri" w:hAnsi="Calibri" w:eastAsia="Calibri" w:cs="Calibri"/>
+          <w:color w:val="232A32"/>
+          <w:sz w:val="21"/>
+          <w:szCs w:val="21"/>
+          <w:b/>
+        </w:rPr>
+        <w:t xml:space="preserve">(10)</w:t>
+      </w:r>
+      <w:r>
+        <w:rPr>
+          <w:rFonts w:ascii="Calibri" w:hAnsi="Calibri" w:eastAsia="Calibri" w:cs="Calibri"/>
+          <w:color w:val="232A32"/>
+          <w:sz w:val="21"/>
+          <w:szCs w:val="21"/>
+        </w:rPr>
+        <w:t xml:space="preserve"> bắt buộc thay mật khẩu được cấp ban đầu để hạn chế nguy cơ người cấp biết mật khẩu; </w:t>
+      </w:r>
+      <w:r>
+        <w:rPr>
+          <w:rFonts w:ascii="Calibri" w:hAnsi="Calibri" w:eastAsia="Calibri" w:cs="Calibri"/>
+          <w:color w:val="232A32"/>
+          <w:sz w:val="21"/>
+          <w:szCs w:val="21"/>
+          <w:b/>
+        </w:rPr>
+        <w:t xml:space="preserve">(11)</w:t>
+      </w:r>
+      <w:r>
+        <w:rPr>
+          <w:rFonts w:ascii="Calibri" w:hAnsi="Calibri" w:eastAsia="Calibri" w:cs="Calibri"/>
+          <w:color w:val="232A32"/>
+          <w:sz w:val="21"/>
+          <w:szCs w:val="21"/>
+        </w:rPr>
+        <w:t xml:space="preserve"> quản lý lịch sử mật khẩu để kiểm soát việc tái sử dụng và tăng khả năng thực thi chính sách. Các quy định cần được áp dụng đồng bộ, đồng thời lưu mật khẩu an toàn và bảo vệ kênh xác thực. Lịch sử mật khẩu không có nghĩa là lưu mật khẩu gốc dưới dạng rõ.</w:t>
+      </w:r>
+    </w:p>
+    <w:p xmlns:w="http://schemas.openxmlformats.org/wordprocessingml/2006/main">
+      <w:pPr>
+        <w:keepLines w:val="0"/>
+        <w:widowControl/>
+        <w:autoSpaceDE/>
+        <w:autoSpaceDN/>
+        <w:spacing w:after="60" w:before="0" w:line="269" w:lineRule="auto"/>
+        <w:rPr>
+          <w:color w:val="666666"/>
+          <w:sz w:val="18"/>
+          <w:szCs w:val="18"/>
+        </w:rPr>
+      </w:pPr>
+      <w:r>
+        <w:rPr>
+          <w:rFonts w:ascii="Calibri" w:hAnsi="Calibri" w:eastAsia="Calibri" w:cs="Calibri"/>
+          <w:color w:val="5B656F"/>
+          <w:sz w:val="18"/>
+          <w:szCs w:val="18"/>
+          <w:i/>
+        </w:rPr>
+        <w:t xml:space="preserve">Nguồn: Slide PDF trang 131–134. Đây là 11 yêu cầu của giáo trình; một số quy định đã khác hướng dẫn bảo mật hiện đại.</w:t>
       </w:r>
     </w:p>
     <w:p>
@@ -367,7 +924,7 @@
         <w:t>Bài 8. Trình bày các quy tắc sử dụng mật khẩu an toàn.</w:t>
       </w:r>
     </w:p>
-    <w:p>
+    <w:p xmlns:w="http://schemas.openxmlformats.org/wordprocessingml/2006/main">
       <w:pPr>
         <w:keepLines w:val="0"/>
         <w:widowControl/>
@@ -385,7 +942,31 @@
           <w:sz w:val="21"/>
           <w:szCs w:val="21"/>
         </w:rPr>
-        <w:t>Người dùng cần đặt mật khẩu dài, khó đoán, không sử dụng tên, ngày sinh hoặc thông tin cá nhân dễ tìm; sử dụng mật khẩu khác nhau cho các tài khoản; không chia sẻ hoặc gửi mật khẩu qua các kênh không an toàn; không nhập mật khẩu vào trang web đáng ngờ; kiểm tra đúng tên miền trước khi đăng nhập; sử dụng trình quản lý mật khẩu đáng tin cậy để tạo và lưu mật khẩu mạnh; bật xác thực đa nhân tố khi có thể; tránh đăng nhập trên thiết bị không tin cậy; và thay đổi mật khẩu ngay khi nghi ngờ bị lộ hoặc tài khoản bị xâm nhập.</w:t>
+        <w:t xml:space="preserve">Theo slide, người dùng cần lựa chọn mật khẩu đủ dài và phức tạp, kết hợp các nhóm ký tự, tránh từ có trong từ điển và thông tin cá nhân dễ đoán; không ghi mật khẩu ra giấy hoặc lưu tại nơi dễ bị người khác tiếp cận; không sử dụng chung một mật khẩu cho nhiều hệ thống; phòng tránh các hình thức đánh cắp như nhìn trộm, keylogger, nghe lén và lừa đảo. Giáo trình còn khuyến nghị thay đổi mật khẩu định kỳ nhưng không quá thường xuyên, khoảng 45 ngày. Đối với quản trị viên, cần thiết lập chính sách mật khẩu và định kỳ kiểm tra khả năng chống dò mật khẩu bằng các công cụ phù hợp trong phạm vi được phép quản lý. Mục đích của các quy tắc là giảm nguy cơ mật khẩu bị đoán, lộ lọt, tái sử dụng hoặc khai thác trái phép.</w:t>
+      </w:r>
+    </w:p>
+    <w:p xmlns:w="http://schemas.openxmlformats.org/wordprocessingml/2006/main">
+      <w:pPr>
+        <w:keepLines w:val="0"/>
+        <w:widowControl/>
+        <w:autoSpaceDE/>
+        <w:autoSpaceDN/>
+        <w:spacing w:after="60" w:before="0" w:line="269" w:lineRule="auto"/>
+        <w:rPr>
+          <w:color w:val="666666"/>
+          <w:sz w:val="18"/>
+          <w:szCs w:val="18"/>
+        </w:rPr>
+      </w:pPr>
+      <w:r>
+        <w:rPr>
+          <w:rFonts w:ascii="Calibri" w:hAnsi="Calibri" w:eastAsia="Calibri" w:cs="Calibri"/>
+          <w:color w:val="5B656F"/>
+          <w:sz w:val="18"/>
+          <w:szCs w:val="18"/>
+          <w:i/>
+        </w:rPr>
+        <w:t xml:space="preserve">Nguồn: Slide PDF trang 135–136. Quy định đổi mật khẩu khoảng 45 ngày là nội dung giáo trình, không phải yêu cầu hiện hành của NIST.</w:t>
       </w:r>
     </w:p>
     <w:p>

</xml_diff>